<commit_message>
Fix Supplementary Tables S1-S3 reference rows: clear Ref 1.00 for variables not included in Model I and Model II
</commit_message>
<xml_diff>
--- a/results/Table_S1_Stunting_Multilevel.docx
+++ b/results/Table_S1_Stunting_Multilevel.docx
@@ -6530,31 +6530,7 @@
             <w:vAlign w:val="center"/>
           </w:tcPr>
           <w:p>
-            <w:pPr>
-              <w:pBdr>
-                <w:top w:val="none" w:sz="0" w:space="0" w:color="000000"/>
-                <w:left w:val="none" w:sz="0" w:space="0" w:color="000000"/>
-                <w:bottom w:val="none" w:sz="0" w:space="0" w:color="000000"/>
-                <w:right w:val="none" w:sz="0" w:space="0" w:color="000000"/>
-              </w:pBdr>
-              <w:spacing w:before="100" w:after="100"/>
-              <w:ind w:left="100" w:right="100"/>
-              <w:rPr>
-                <w:rFonts w:ascii="Arial" w:eastAsia="Arial" w:hAnsi="Arial" w:cs="Arial"/>
-                <w:color w:val="000000"/>
-                <w:sz w:val="22"/>
-                <w:szCs w:val="22"/>
-              </w:rPr>
-            </w:pPr>
-            <w:r>
-              <w:rPr>
-                <w:rFonts w:ascii="Arial" w:eastAsia="Arial" w:hAnsi="Arial" w:cs="Arial"/>
-                <w:color w:val="000000"/>
-                <w:sz w:val="22"/>
-                <w:szCs w:val="22"/>
-              </w:rPr>
-              <w:t>1.00</w:t>
-            </w:r>
+            <w:r/>
           </w:p>
         </w:tc>
         <w:tc>
@@ -7217,31 +7193,7 @@
             <w:vAlign w:val="center"/>
           </w:tcPr>
           <w:p>
-            <w:pPr>
-              <w:pBdr>
-                <w:top w:val="none" w:sz="0" w:space="0" w:color="000000"/>
-                <w:left w:val="none" w:sz="0" w:space="0" w:color="000000"/>
-                <w:bottom w:val="none" w:sz="0" w:space="0" w:color="000000"/>
-                <w:right w:val="none" w:sz="0" w:space="0" w:color="000000"/>
-              </w:pBdr>
-              <w:spacing w:before="100" w:after="100"/>
-              <w:ind w:left="100" w:right="100"/>
-              <w:rPr>
-                <w:rFonts w:ascii="Arial" w:eastAsia="Arial" w:hAnsi="Arial" w:cs="Arial"/>
-                <w:color w:val="000000"/>
-                <w:sz w:val="22"/>
-                <w:szCs w:val="22"/>
-              </w:rPr>
-            </w:pPr>
-            <w:r>
-              <w:rPr>
-                <w:rFonts w:ascii="Arial" w:eastAsia="Arial" w:hAnsi="Arial" w:cs="Arial"/>
-                <w:color w:val="000000"/>
-                <w:sz w:val="22"/>
-                <w:szCs w:val="22"/>
-              </w:rPr>
-              <w:t>1.00</w:t>
-            </w:r>
+            <w:r/>
           </w:p>
         </w:tc>
         <w:tc>
@@ -7678,31 +7630,7 @@
             <w:vAlign w:val="center"/>
           </w:tcPr>
           <w:p>
-            <w:pPr>
-              <w:pBdr>
-                <w:top w:val="none" w:sz="0" w:space="0" w:color="000000"/>
-                <w:left w:val="none" w:sz="0" w:space="0" w:color="000000"/>
-                <w:bottom w:val="none" w:sz="0" w:space="0" w:color="000000"/>
-                <w:right w:val="none" w:sz="0" w:space="0" w:color="000000"/>
-              </w:pBdr>
-              <w:spacing w:before="100" w:after="100"/>
-              <w:ind w:left="100" w:right="100"/>
-              <w:rPr>
-                <w:rFonts w:ascii="Arial" w:eastAsia="Arial" w:hAnsi="Arial" w:cs="Arial"/>
-                <w:color w:val="000000"/>
-                <w:sz w:val="22"/>
-                <w:szCs w:val="22"/>
-              </w:rPr>
-            </w:pPr>
-            <w:r>
-              <w:rPr>
-                <w:rFonts w:ascii="Arial" w:eastAsia="Arial" w:hAnsi="Arial" w:cs="Arial"/>
-                <w:color w:val="000000"/>
-                <w:sz w:val="22"/>
-                <w:szCs w:val="22"/>
-              </w:rPr>
-              <w:t>1.00</w:t>
-            </w:r>
+            <w:r/>
           </w:p>
         </w:tc>
         <w:tc>
@@ -8139,31 +8067,7 @@
             <w:vAlign w:val="center"/>
           </w:tcPr>
           <w:p>
-            <w:pPr>
-              <w:pBdr>
-                <w:top w:val="none" w:sz="0" w:space="0" w:color="000000"/>
-                <w:left w:val="none" w:sz="0" w:space="0" w:color="000000"/>
-                <w:bottom w:val="none" w:sz="0" w:space="0" w:color="000000"/>
-                <w:right w:val="none" w:sz="0" w:space="0" w:color="000000"/>
-              </w:pBdr>
-              <w:spacing w:before="100" w:after="100"/>
-              <w:ind w:left="100" w:right="100"/>
-              <w:rPr>
-                <w:rFonts w:ascii="Arial" w:eastAsia="Arial" w:hAnsi="Arial" w:cs="Arial"/>
-                <w:color w:val="000000"/>
-                <w:sz w:val="22"/>
-                <w:szCs w:val="22"/>
-              </w:rPr>
-            </w:pPr>
-            <w:r>
-              <w:rPr>
-                <w:rFonts w:ascii="Arial" w:eastAsia="Arial" w:hAnsi="Arial" w:cs="Arial"/>
-                <w:color w:val="000000"/>
-                <w:sz w:val="22"/>
-                <w:szCs w:val="22"/>
-              </w:rPr>
-              <w:t>1.00</w:t>
-            </w:r>
+            <w:r/>
           </w:p>
         </w:tc>
         <w:tc>
@@ -8600,31 +8504,7 @@
             <w:vAlign w:val="center"/>
           </w:tcPr>
           <w:p>
-            <w:pPr>
-              <w:pBdr>
-                <w:top w:val="none" w:sz="0" w:space="0" w:color="000000"/>
-                <w:left w:val="none" w:sz="0" w:space="0" w:color="000000"/>
-                <w:bottom w:val="none" w:sz="0" w:space="0" w:color="000000"/>
-                <w:right w:val="none" w:sz="0" w:space="0" w:color="000000"/>
-              </w:pBdr>
-              <w:spacing w:before="100" w:after="100"/>
-              <w:ind w:left="100" w:right="100"/>
-              <w:rPr>
-                <w:rFonts w:ascii="Arial" w:eastAsia="Arial" w:hAnsi="Arial" w:cs="Arial"/>
-                <w:color w:val="000000"/>
-                <w:sz w:val="22"/>
-                <w:szCs w:val="22"/>
-              </w:rPr>
-            </w:pPr>
-            <w:r>
-              <w:rPr>
-                <w:rFonts w:ascii="Arial" w:eastAsia="Arial" w:hAnsi="Arial" w:cs="Arial"/>
-                <w:color w:val="000000"/>
-                <w:sz w:val="22"/>
-                <w:szCs w:val="22"/>
-              </w:rPr>
-              <w:t>1.00</w:t>
-            </w:r>
+            <w:r/>
           </w:p>
         </w:tc>
         <w:tc>
@@ -9061,31 +8941,7 @@
             <w:vAlign w:val="center"/>
           </w:tcPr>
           <w:p>
-            <w:pPr>
-              <w:pBdr>
-                <w:top w:val="none" w:sz="0" w:space="0" w:color="000000"/>
-                <w:left w:val="none" w:sz="0" w:space="0" w:color="000000"/>
-                <w:bottom w:val="none" w:sz="0" w:space="0" w:color="000000"/>
-                <w:right w:val="none" w:sz="0" w:space="0" w:color="000000"/>
-              </w:pBdr>
-              <w:spacing w:before="100" w:after="100"/>
-              <w:ind w:left="100" w:right="100"/>
-              <w:rPr>
-                <w:rFonts w:ascii="Arial" w:eastAsia="Arial" w:hAnsi="Arial" w:cs="Arial"/>
-                <w:color w:val="000000"/>
-                <w:sz w:val="22"/>
-                <w:szCs w:val="22"/>
-              </w:rPr>
-            </w:pPr>
-            <w:r>
-              <w:rPr>
-                <w:rFonts w:ascii="Arial" w:eastAsia="Arial" w:hAnsi="Arial" w:cs="Arial"/>
-                <w:color w:val="000000"/>
-                <w:sz w:val="22"/>
-                <w:szCs w:val="22"/>
-              </w:rPr>
-              <w:t>1.00</w:t>
-            </w:r>
+            <w:r/>
           </w:p>
         </w:tc>
         <w:tc>
@@ -9522,31 +9378,7 @@
             <w:vAlign w:val="center"/>
           </w:tcPr>
           <w:p>
-            <w:pPr>
-              <w:pBdr>
-                <w:top w:val="none" w:sz="0" w:space="0" w:color="000000"/>
-                <w:left w:val="none" w:sz="0" w:space="0" w:color="000000"/>
-                <w:bottom w:val="none" w:sz="0" w:space="0" w:color="000000"/>
-                <w:right w:val="none" w:sz="0" w:space="0" w:color="000000"/>
-              </w:pBdr>
-              <w:spacing w:before="100" w:after="100"/>
-              <w:ind w:left="100" w:right="100"/>
-              <w:rPr>
-                <w:rFonts w:ascii="Arial" w:eastAsia="Arial" w:hAnsi="Arial" w:cs="Arial"/>
-                <w:color w:val="000000"/>
-                <w:sz w:val="22"/>
-                <w:szCs w:val="22"/>
-              </w:rPr>
-            </w:pPr>
-            <w:r>
-              <w:rPr>
-                <w:rFonts w:ascii="Arial" w:eastAsia="Arial" w:hAnsi="Arial" w:cs="Arial"/>
-                <w:color w:val="000000"/>
-                <w:sz w:val="22"/>
-                <w:szCs w:val="22"/>
-              </w:rPr>
-              <w:t>1.00</w:t>
-            </w:r>
+            <w:r/>
           </w:p>
         </w:tc>
         <w:tc>
@@ -9983,31 +9815,7 @@
             <w:vAlign w:val="center"/>
           </w:tcPr>
           <w:p>
-            <w:pPr>
-              <w:pBdr>
-                <w:top w:val="none" w:sz="0" w:space="0" w:color="000000"/>
-                <w:left w:val="none" w:sz="0" w:space="0" w:color="000000"/>
-                <w:bottom w:val="none" w:sz="0" w:space="0" w:color="000000"/>
-                <w:right w:val="none" w:sz="0" w:space="0" w:color="000000"/>
-              </w:pBdr>
-              <w:spacing w:before="100" w:after="100"/>
-              <w:ind w:left="100" w:right="100"/>
-              <w:rPr>
-                <w:rFonts w:ascii="Arial" w:eastAsia="Arial" w:hAnsi="Arial" w:cs="Arial"/>
-                <w:color w:val="000000"/>
-                <w:sz w:val="22"/>
-                <w:szCs w:val="22"/>
-              </w:rPr>
-            </w:pPr>
-            <w:r>
-              <w:rPr>
-                <w:rFonts w:ascii="Arial" w:eastAsia="Arial" w:hAnsi="Arial" w:cs="Arial"/>
-                <w:color w:val="000000"/>
-                <w:sz w:val="22"/>
-                <w:szCs w:val="22"/>
-              </w:rPr>
-              <w:t>1.00</w:t>
-            </w:r>
+            <w:r/>
           </w:p>
         </w:tc>
         <w:tc>
@@ -10444,31 +10252,7 @@
             <w:vAlign w:val="center"/>
           </w:tcPr>
           <w:p>
-            <w:pPr>
-              <w:pBdr>
-                <w:top w:val="none" w:sz="0" w:space="0" w:color="000000"/>
-                <w:left w:val="none" w:sz="0" w:space="0" w:color="000000"/>
-                <w:bottom w:val="none" w:sz="0" w:space="0" w:color="000000"/>
-                <w:right w:val="none" w:sz="0" w:space="0" w:color="000000"/>
-              </w:pBdr>
-              <w:spacing w:before="100" w:after="100"/>
-              <w:ind w:left="100" w:right="100"/>
-              <w:rPr>
-                <w:rFonts w:ascii="Arial" w:eastAsia="Arial" w:hAnsi="Arial" w:cs="Arial"/>
-                <w:color w:val="000000"/>
-                <w:sz w:val="22"/>
-                <w:szCs w:val="22"/>
-              </w:rPr>
-            </w:pPr>
-            <w:r>
-              <w:rPr>
-                <w:rFonts w:ascii="Arial" w:eastAsia="Arial" w:hAnsi="Arial" w:cs="Arial"/>
-                <w:color w:val="000000"/>
-                <w:sz w:val="22"/>
-                <w:szCs w:val="22"/>
-              </w:rPr>
-              <w:t>1.00</w:t>
-            </w:r>
+            <w:r/>
           </w:p>
         </w:tc>
         <w:tc>
@@ -10490,31 +10274,7 @@
             <w:vAlign w:val="center"/>
           </w:tcPr>
           <w:p>
-            <w:pPr>
-              <w:pBdr>
-                <w:top w:val="none" w:sz="0" w:space="0" w:color="000000"/>
-                <w:left w:val="none" w:sz="0" w:space="0" w:color="000000"/>
-                <w:bottom w:val="none" w:sz="0" w:space="0" w:color="000000"/>
-                <w:right w:val="none" w:sz="0" w:space="0" w:color="000000"/>
-              </w:pBdr>
-              <w:spacing w:before="100" w:after="100"/>
-              <w:ind w:left="100" w:right="100"/>
-              <w:rPr>
-                <w:rFonts w:ascii="Arial" w:eastAsia="Arial" w:hAnsi="Arial" w:cs="Arial"/>
-                <w:color w:val="000000"/>
-                <w:sz w:val="22"/>
-                <w:szCs w:val="22"/>
-              </w:rPr>
-            </w:pPr>
-            <w:r>
-              <w:rPr>
-                <w:rFonts w:ascii="Arial" w:eastAsia="Arial" w:hAnsi="Arial" w:cs="Arial"/>
-                <w:color w:val="000000"/>
-                <w:sz w:val="22"/>
-                <w:szCs w:val="22"/>
-              </w:rPr>
-              <w:t>1.00</w:t>
-            </w:r>
+            <w:r/>
           </w:p>
         </w:tc>
         <w:tc>
@@ -12198,31 +11958,7 @@
             <w:vAlign w:val="center"/>
           </w:tcPr>
           <w:p>
-            <w:pPr>
-              <w:pBdr>
-                <w:top w:val="none" w:sz="0" w:space="0" w:color="000000"/>
-                <w:left w:val="none" w:sz="0" w:space="0" w:color="000000"/>
-                <w:bottom w:val="none" w:sz="0" w:space="0" w:color="000000"/>
-                <w:right w:val="none" w:sz="0" w:space="0" w:color="000000"/>
-              </w:pBdr>
-              <w:spacing w:before="100" w:after="100"/>
-              <w:ind w:left="100" w:right="100"/>
-              <w:rPr>
-                <w:rFonts w:ascii="Arial" w:eastAsia="Arial" w:hAnsi="Arial" w:cs="Arial"/>
-                <w:color w:val="000000"/>
-                <w:sz w:val="22"/>
-                <w:szCs w:val="22"/>
-              </w:rPr>
-            </w:pPr>
-            <w:r>
-              <w:rPr>
-                <w:rFonts w:ascii="Arial" w:eastAsia="Arial" w:hAnsi="Arial" w:cs="Arial"/>
-                <w:color w:val="000000"/>
-                <w:sz w:val="22"/>
-                <w:szCs w:val="22"/>
-              </w:rPr>
-              <w:t>1.00</w:t>
-            </w:r>
+            <w:r/>
           </w:p>
         </w:tc>
         <w:tc>
@@ -12244,31 +11980,7 @@
             <w:vAlign w:val="center"/>
           </w:tcPr>
           <w:p>
-            <w:pPr>
-              <w:pBdr>
-                <w:top w:val="none" w:sz="0" w:space="0" w:color="000000"/>
-                <w:left w:val="none" w:sz="0" w:space="0" w:color="000000"/>
-                <w:bottom w:val="none" w:sz="0" w:space="0" w:color="000000"/>
-                <w:right w:val="none" w:sz="0" w:space="0" w:color="000000"/>
-              </w:pBdr>
-              <w:spacing w:before="100" w:after="100"/>
-              <w:ind w:left="100" w:right="100"/>
-              <w:rPr>
-                <w:rFonts w:ascii="Arial" w:eastAsia="Arial" w:hAnsi="Arial" w:cs="Arial"/>
-                <w:color w:val="000000"/>
-                <w:sz w:val="22"/>
-                <w:szCs w:val="22"/>
-              </w:rPr>
-            </w:pPr>
-            <w:r>
-              <w:rPr>
-                <w:rFonts w:ascii="Arial" w:eastAsia="Arial" w:hAnsi="Arial" w:cs="Arial"/>
-                <w:color w:val="000000"/>
-                <w:sz w:val="22"/>
-                <w:szCs w:val="22"/>
-              </w:rPr>
-              <w:t>1.00</w:t>
-            </w:r>
+            <w:r/>
           </w:p>
         </w:tc>
         <w:tc>

</xml_diff>